<commit_message>
Thêm Bài tập cuối chương I (Toán 11); sửa hiển thị dấu trừ trong slide; phân bố đáp án Bài 5, 6 Toán 10
</commit_message>
<xml_diff>
--- a/khbd/Toan10/KHBD_TOAN10_Bai5_T16-17.docx
+++ b/khbd/Toan10/KHBD_TOAN10_Bai5_T16-17.docx
@@ -11778,6 +11778,9 @@
               <w:t xml:space="preserve">A. </w:t>
             </w:r>
             <m:oMath>
+              <m:r>
+                <m:t>−</m:t>
+              </m:r>
               <m:f>
                 <m:fPr>
                   <m:type m:val="bar"/>
@@ -11815,9 +11818,6 @@
               <w:t xml:space="preserve">B. </w:t>
             </w:r>
             <m:oMath>
-              <m:r>
-                <m:t>−</m:t>
-              </m:r>
               <m:f>
                 <m:fPr>
                   <m:type m:val="bar"/>
@@ -12037,28 +12037,10 @@
                 <m:rPr>
                   <m:sty m:val="p"/>
                 </m:rPr>
-                <m:t>sin</m:t>
+                <m:t>cot</m:t>
               </m:r>
               <m:r>
                 <m:t>α&gt;0</m:t>
-              </m:r>
-            </m:oMath>
-            <w:r>
-              <w:rPr>
-                <w:rFonts w:ascii="Times New Roman" w:hAnsi="Times New Roman" w:eastAsia="Times New Roman"/>
-                <w:sz w:val="26"/>
-              </w:rPr>
-              <w:t xml:space="preserve"> và </w:t>
-            </w:r>
-            <m:oMath>
-              <m:r>
-                <m:rPr>
-                  <m:sty m:val="p"/>
-                </m:rPr>
-                <m:t>cos</m:t>
-              </m:r>
-              <m:r>
-                <m:t>α&lt;0</m:t>
               </m:r>
             </m:oMath>
           </w:p>
@@ -12168,10 +12150,28 @@
                 <m:rPr>
                   <m:sty m:val="p"/>
                 </m:rPr>
-                <m:t>cot</m:t>
+                <m:t>sin</m:t>
               </m:r>
               <m:r>
                 <m:t>α&gt;0</m:t>
+              </m:r>
+            </m:oMath>
+            <w:r>
+              <w:rPr>
+                <w:rFonts w:ascii="Times New Roman" w:hAnsi="Times New Roman" w:eastAsia="Times New Roman"/>
+                <w:sz w:val="26"/>
+              </w:rPr>
+              <w:t xml:space="preserve"> và </w:t>
+            </w:r>
+            <m:oMath>
+              <m:r>
+                <m:rPr>
+                  <m:sty m:val="p"/>
+                </m:rPr>
+                <m:t>cos</m:t>
+              </m:r>
+              <m:r>
+                <m:t>α&lt;0</m:t>
               </m:r>
             </m:oMath>
           </w:p>
@@ -12265,17 +12265,9 @@
                   <m:type m:val="bar"/>
                 </m:fPr>
                 <m:num>
-                  <m:rad>
-                    <m:radPr>
-                      <m:degHide m:val="on"/>
-                    </m:radPr>
-                    <m:deg/>
-                    <m:e>
-                      <m:r>
-                        <m:t>2</m:t>
-                      </m:r>
-                    </m:e>
-                  </m:rad>
+                  <m:r>
+                    <m:t>1</m:t>
+                  </m:r>
                 </m:num>
                 <m:den>
                   <m:r>
@@ -12360,9 +12352,17 @@
                   <m:type m:val="bar"/>
                 </m:fPr>
                 <m:num>
-                  <m:r>
-                    <m:t>1</m:t>
-                  </m:r>
+                  <m:rad>
+                    <m:radPr>
+                      <m:degHide m:val="on"/>
+                    </m:radPr>
+                    <m:deg/>
+                    <m:e>
+                      <m:r>
+                        <m:t>2</m:t>
+                      </m:r>
+                    </m:e>
+                  </m:rad>
                 </m:num>
                 <m:den>
                   <m:r>
@@ -12512,7 +12512,7 @@
                 <m:rPr>
                   <m:sty m:val="p"/>
                 </m:rPr>
-                <m:t>sin</m:t>
+                <m:t>tan</m:t>
               </m:r>
               <m:r>
                 <m:t>(</m:t>
@@ -12536,7 +12536,7 @@
                 <m:rPr>
                   <m:sty m:val="p"/>
                 </m:rPr>
-                <m:t>sin</m:t>
+                <m:t>tan</m:t>
               </m:r>
               <m:r>
                 <m:t>α</m:t>
@@ -12624,7 +12624,7 @@
                 <m:rPr>
                   <m:sty m:val="p"/>
                 </m:rPr>
-                <m:t>tan</m:t>
+                <m:t>sin</m:t>
               </m:r>
               <m:r>
                 <m:t>(</m:t>
@@ -12648,7 +12648,7 @@
                 <m:rPr>
                   <m:sty m:val="p"/>
                 </m:rPr>
-                <m:t>tan</m:t>
+                <m:t>sin</m:t>
               </m:r>
               <m:r>
                 <m:t>α</m:t>
@@ -12854,21 +12854,9 @@
               <w:t xml:space="preserve">A. </w:t>
             </w:r>
             <m:oMath>
-              <m:f>
-                <m:fPr>
-                  <m:type m:val="bar"/>
-                </m:fPr>
-                <m:num>
-                  <m:r>
-                    <m:t>3</m:t>
-                  </m:r>
-                </m:num>
-                <m:den>
-                  <m:r>
-                    <m:t>2</m:t>
-                  </m:r>
-                </m:den>
-              </m:f>
+              <m:r>
+                <m:t>1</m:t>
+              </m:r>
             </m:oMath>
           </w:p>
         </w:tc>
@@ -12891,9 +12879,21 @@
               <w:t xml:space="preserve">B. </w:t>
             </w:r>
             <m:oMath>
-              <m:r>
-                <m:t>1</m:t>
-              </m:r>
+              <m:f>
+                <m:fPr>
+                  <m:type m:val="bar"/>
+                </m:fPr>
+                <m:num>
+                  <m:r>
+                    <m:t>3</m:t>
+                  </m:r>
+                </m:num>
+                <m:den>
+                  <m:r>
+                    <m:t>2</m:t>
+                  </m:r>
+                </m:den>
+              </m:f>
             </m:oMath>
           </w:p>
         </w:tc>
@@ -13139,7 +13139,7 @@
             </w:r>
             <m:oMath>
               <m:r>
-                <m:t>3</m:t>
+                <m:t>−3</m:t>
               </m:r>
             </m:oMath>
           </w:p>
@@ -13201,7 +13201,7 @@
             </w:r>
             <m:oMath>
               <m:r>
-                <m:t>−3</m:t>
+                <m:t>3</m:t>
               </m:r>
             </m:oMath>
           </w:p>
@@ -13823,7 +13823,7 @@
                 <w:rFonts w:ascii="Times New Roman" w:hAnsi="Times New Roman" w:eastAsia="Times New Roman"/>
                 <w:sz w:val="24"/>
               </w:rPr>
-              <w:t>A</w:t>
+              <w:t>B</w:t>
             </w:r>
           </w:p>
         </w:tc>
@@ -13842,26 +13842,7 @@
                 <w:rFonts w:ascii="Times New Roman" w:hAnsi="Times New Roman" w:eastAsia="Times New Roman"/>
                 <w:sz w:val="24"/>
               </w:rPr>
-              <w:t>A</w:t>
-            </w:r>
-          </w:p>
-        </w:tc>
-        <w:tc>
-          <w:tcPr>
-            <w:tcW w:type="dxa" w:w="1020"/>
-            <w:vAlign w:val="center"/>
-          </w:tcPr>
-          <w:p>
-            <w:pPr>
-              <w:spacing w:before="0" w:after="20" w:line="264" w:lineRule="auto"/>
-              <w:jc w:val="center"/>
-            </w:pPr>
-            <w:r>
-              <w:rPr>
-                <w:rFonts w:ascii="Times New Roman" w:hAnsi="Times New Roman" w:eastAsia="Times New Roman"/>
-                <w:sz w:val="24"/>
-              </w:rPr>
-              <w:t>A</w:t>
+              <w:t>D</w:t>
             </w:r>
           </w:p>
         </w:tc>
@@ -13918,7 +13899,26 @@
                 <w:rFonts w:ascii="Times New Roman" w:hAnsi="Times New Roman" w:eastAsia="Times New Roman"/>
                 <w:sz w:val="24"/>
               </w:rPr>
-              <w:t>A</w:t>
+              <w:t>B</w:t>
+            </w:r>
+          </w:p>
+        </w:tc>
+        <w:tc>
+          <w:tcPr>
+            <w:tcW w:type="dxa" w:w="1020"/>
+            <w:vAlign w:val="center"/>
+          </w:tcPr>
+          <w:p>
+            <w:pPr>
+              <w:spacing w:before="0" w:after="20" w:line="264" w:lineRule="auto"/>
+              <w:jc w:val="center"/>
+            </w:pPr>
+            <w:r>
+              <w:rPr>
+                <w:rFonts w:ascii="Times New Roman" w:hAnsi="Times New Roman" w:eastAsia="Times New Roman"/>
+                <w:sz w:val="24"/>
+              </w:rPr>
+              <w:t>C</w:t>
             </w:r>
           </w:p>
         </w:tc>

</xml_diff>